<commit_message>
Removed useless data on Mission model
</commit_message>
<xml_diff>
--- a/flower_backend/doctypes/BV.docx
+++ b/flower_backend/doctypes/BV.docx
@@ -2158,95 +2158,6 @@
                 <w:sz w:val="16"/>
                 <w:szCs w:val="16"/>
               </w:rPr>
-              <w:t>Rémunération brute par JEH :</w:t>
-            </w:r>
-          </w:p>
-        </w:tc>
-        <w:tc>
-          <w:tcPr>
-            <w:tcW w:w="2694" w:type="dxa"/>
-          </w:tcPr>
-          <w:p>
-            <w:pPr>
-              <w:jc w:val="right"/>
-              <w:rPr>
-                <w:sz w:val="16"/>
-                <w:szCs w:val="16"/>
-              </w:rPr>
-            </w:pPr>
-            <w:r>
-              <w:rPr>
-                <w:sz w:val="16"/>
-                <w:szCs w:val="16"/>
-              </w:rPr>
-              <w:t>{</w:t>
-            </w:r>
-            <w:proofErr w:type="gramStart"/>
-            <w:r>
-              <w:rPr>
-                <w:sz w:val="16"/>
-                <w:szCs w:val="16"/>
-              </w:rPr>
-              <w:t xml:space="preserve">{ </w:t>
-            </w:r>
-            <w:r>
-              <w:rPr>
-                <w:sz w:val="16"/>
-                <w:szCs w:val="16"/>
-              </w:rPr>
-              <w:t>rd</w:t>
-            </w:r>
-            <w:proofErr w:type="gramEnd"/>
-            <w:r>
-              <w:rPr>
-                <w:sz w:val="16"/>
-                <w:szCs w:val="16"/>
-              </w:rPr>
-              <w:t>(</w:t>
-            </w:r>
-            <w:proofErr w:type="spellStart"/>
-            <w:r>
-              <w:rPr>
-                <w:sz w:val="16"/>
-                <w:szCs w:val="16"/>
-              </w:rPr>
-              <w:t>bv.remunerationBruteParJEH</w:t>
-            </w:r>
-            <w:proofErr w:type="spellEnd"/>
-            <w:r>
-              <w:rPr>
-                <w:sz w:val="16"/>
-                <w:szCs w:val="16"/>
-              </w:rPr>
-              <w:t>)</w:t>
-            </w:r>
-            <w:r>
-              <w:rPr>
-                <w:sz w:val="16"/>
-                <w:szCs w:val="16"/>
-              </w:rPr>
-              <w:t xml:space="preserve"> }}</w:t>
-            </w:r>
-          </w:p>
-        </w:tc>
-      </w:tr>
-      <w:tr>
-        <w:tc>
-          <w:tcPr>
-            <w:tcW w:w="5103" w:type="dxa"/>
-          </w:tcPr>
-          <w:p>
-            <w:pPr>
-              <w:rPr>
-                <w:sz w:val="16"/>
-                <w:szCs w:val="16"/>
-              </w:rPr>
-            </w:pPr>
-            <w:r>
-              <w:rPr>
-                <w:sz w:val="16"/>
-                <w:szCs w:val="16"/>
-              </w:rPr>
               <w:t>Base U.R.S.S.A.F. :</w:t>
             </w:r>
           </w:p>
@@ -3195,13 +3106,7 @@
               <w:rPr>
                 <w:sz w:val="18"/>
               </w:rPr>
-              <w:t xml:space="preserve">{ </w:t>
-            </w:r>
-            <w:r>
-              <w:rPr>
-                <w:sz w:val="18"/>
-              </w:rPr>
-              <w:t>rd</w:t>
+              <w:t>{ rd</w:t>
             </w:r>
             <w:proofErr w:type="gramEnd"/>
             <w:r>
@@ -3261,13 +3166,7 @@
               <w:rPr>
                 <w:sz w:val="18"/>
               </w:rPr>
-              <w:t xml:space="preserve">{ </w:t>
-            </w:r>
-            <w:r>
-              <w:rPr>
-                <w:sz w:val="18"/>
-              </w:rPr>
-              <w:t>rd</w:t>
+              <w:t>{ rd</w:t>
             </w:r>
             <w:proofErr w:type="gramEnd"/>
             <w:r>
@@ -3412,26 +3311,14 @@
               <w:rPr>
                 <w:sz w:val="18"/>
               </w:rPr>
-              <w:t xml:space="preserve">{ </w:t>
-            </w:r>
-            <w:r>
-              <w:rPr>
-                <w:sz w:val="18"/>
-              </w:rPr>
-              <w:t>rd</w:t>
+              <w:t>{ rd</w:t>
             </w:r>
             <w:proofErr w:type="gramEnd"/>
             <w:r>
               <w:rPr>
                 <w:sz w:val="18"/>
               </w:rPr>
-              <w:t>(</w:t>
-            </w:r>
-            <w:r>
-              <w:rPr>
-                <w:sz w:val="18"/>
-              </w:rPr>
-              <w:t>bv.coti_</w:t>
+              <w:t>(bv.coti_</w:t>
             </w:r>
             <w:r>
               <w:rPr>
@@ -3477,26 +3364,14 @@
               <w:rPr>
                 <w:sz w:val="18"/>
               </w:rPr>
-              <w:t xml:space="preserve">{ </w:t>
-            </w:r>
-            <w:r>
-              <w:rPr>
-                <w:sz w:val="18"/>
-              </w:rPr>
-              <w:t>rd</w:t>
+              <w:t>{ rd</w:t>
             </w:r>
             <w:proofErr w:type="gramEnd"/>
             <w:r>
               <w:rPr>
                 <w:sz w:val="18"/>
               </w:rPr>
-              <w:t>(</w:t>
-            </w:r>
-            <w:r>
-              <w:rPr>
-                <w:sz w:val="18"/>
-              </w:rPr>
-              <w:t>bv.coti_</w:t>
+              <w:t>(bv.coti_</w:t>
             </w:r>
             <w:r>
               <w:rPr>
@@ -3542,26 +3417,14 @@
               <w:rPr>
                 <w:sz w:val="18"/>
               </w:rPr>
-              <w:t xml:space="preserve">{ </w:t>
-            </w:r>
-            <w:r>
-              <w:rPr>
-                <w:sz w:val="18"/>
-              </w:rPr>
-              <w:t>rd</w:t>
+              <w:t>{ rd</w:t>
             </w:r>
             <w:proofErr w:type="gramEnd"/>
             <w:r>
               <w:rPr>
                 <w:sz w:val="18"/>
               </w:rPr>
-              <w:t>(</w:t>
-            </w:r>
-            <w:r>
-              <w:rPr>
-                <w:sz w:val="18"/>
-              </w:rPr>
-              <w:t>bv.coti_</w:t>
+              <w:t>(bv.coti_</w:t>
             </w:r>
             <w:r>
               <w:rPr>
@@ -3718,26 +3581,14 @@
               <w:rPr>
                 <w:sz w:val="18"/>
               </w:rPr>
-              <w:t xml:space="preserve">{ </w:t>
-            </w:r>
-            <w:r>
-              <w:rPr>
-                <w:sz w:val="18"/>
-              </w:rPr>
-              <w:t>rd</w:t>
+              <w:t>{ rd</w:t>
             </w:r>
             <w:proofErr w:type="gramEnd"/>
             <w:r>
               <w:rPr>
                 <w:sz w:val="18"/>
               </w:rPr>
-              <w:t>(</w:t>
-            </w:r>
-            <w:r>
-              <w:rPr>
-                <w:sz w:val="18"/>
-              </w:rPr>
-              <w:t>bv.coti_</w:t>
+              <w:t>(bv.coti_</w:t>
             </w:r>
             <w:r>
               <w:rPr>
@@ -3782,26 +3633,14 @@
               <w:rPr>
                 <w:sz w:val="18"/>
               </w:rPr>
-              <w:t xml:space="preserve">{ </w:t>
-            </w:r>
-            <w:r>
-              <w:rPr>
-                <w:sz w:val="18"/>
-              </w:rPr>
-              <w:t>rd</w:t>
+              <w:t>{ rd</w:t>
             </w:r>
             <w:proofErr w:type="gramEnd"/>
             <w:r>
               <w:rPr>
                 <w:sz w:val="18"/>
               </w:rPr>
-              <w:t>(</w:t>
-            </w:r>
-            <w:r>
-              <w:rPr>
-                <w:sz w:val="18"/>
-              </w:rPr>
-              <w:t>bv.coti_</w:t>
+              <w:t>(bv.coti_</w:t>
             </w:r>
             <w:r>
               <w:rPr>
@@ -3846,26 +3685,14 @@
               <w:rPr>
                 <w:sz w:val="18"/>
               </w:rPr>
-              <w:t xml:space="preserve">{ </w:t>
-            </w:r>
-            <w:r>
-              <w:rPr>
-                <w:sz w:val="18"/>
-              </w:rPr>
-              <w:t>rd</w:t>
+              <w:t>{ rd</w:t>
             </w:r>
             <w:proofErr w:type="gramEnd"/>
             <w:r>
               <w:rPr>
                 <w:sz w:val="18"/>
               </w:rPr>
-              <w:t>(</w:t>
-            </w:r>
-            <w:r>
-              <w:rPr>
-                <w:sz w:val="18"/>
-              </w:rPr>
-              <w:t xml:space="preserve">bv.coti_retraite_2.taux_realisateur) </w:t>
+              <w:t xml:space="preserve">(bv.coti_retraite_2.taux_realisateur) </w:t>
             </w:r>
             <w:r>
               <w:rPr>
@@ -3898,26 +3725,14 @@
               <w:rPr>
                 <w:sz w:val="18"/>
               </w:rPr>
-              <w:t xml:space="preserve">{ </w:t>
-            </w:r>
-            <w:r>
-              <w:rPr>
-                <w:sz w:val="18"/>
-              </w:rPr>
-              <w:t>rd</w:t>
+              <w:t>{ rd</w:t>
             </w:r>
             <w:proofErr w:type="gramEnd"/>
             <w:r>
               <w:rPr>
                 <w:sz w:val="18"/>
               </w:rPr>
-              <w:t>(</w:t>
-            </w:r>
-            <w:r>
-              <w:rPr>
-                <w:sz w:val="18"/>
-              </w:rPr>
-              <w:t>bv.coti_</w:t>
+              <w:t>(bv.coti_</w:t>
             </w:r>
             <w:r>
               <w:rPr>
@@ -4115,13 +3930,7 @@
               <w:rPr>
                 <w:sz w:val="18"/>
               </w:rPr>
-              <w:t xml:space="preserve">{ </w:t>
-            </w:r>
-            <w:r>
-              <w:rPr>
-                <w:sz w:val="18"/>
-              </w:rPr>
-              <w:t>rd</w:t>
+              <w:t>{ rd</w:t>
             </w:r>
             <w:proofErr w:type="gramEnd"/>
             <w:r>
@@ -4181,13 +3990,7 @@
               <w:rPr>
                 <w:sz w:val="18"/>
               </w:rPr>
-              <w:t xml:space="preserve">{ </w:t>
-            </w:r>
-            <w:r>
-              <w:rPr>
-                <w:sz w:val="18"/>
-              </w:rPr>
-              <w:t>rd</w:t>
+              <w:t>{ rd</w:t>
             </w:r>
             <w:proofErr w:type="gramEnd"/>
             <w:r>
@@ -4400,13 +4203,7 @@
               <w:rPr>
                 <w:sz w:val="18"/>
               </w:rPr>
-              <w:t xml:space="preserve">{ </w:t>
-            </w:r>
-            <w:r>
-              <w:rPr>
-                <w:sz w:val="18"/>
-              </w:rPr>
-              <w:t>rd</w:t>
+              <w:t>{ rd</w:t>
             </w:r>
             <w:proofErr w:type="gramEnd"/>
             <w:r>
@@ -4466,13 +4263,7 @@
               <w:rPr>
                 <w:sz w:val="18"/>
               </w:rPr>
-              <w:t xml:space="preserve">{ </w:t>
-            </w:r>
-            <w:r>
-              <w:rPr>
-                <w:sz w:val="18"/>
-              </w:rPr>
-              <w:t>rd</w:t>
+              <w:t>{ rd</w:t>
             </w:r>
             <w:proofErr w:type="gramEnd"/>
             <w:r>
@@ -5528,14 +5319,95 @@
               <w:rPr>
                 <w:sz w:val="18"/>
               </w:rPr>
+              <w:t>EXONÉRATION DE COTISATIONS JUNIOR</w:t>
+            </w:r>
+          </w:p>
+        </w:tc>
+        <w:tc>
+          <w:tcPr>
+            <w:tcW w:w="992" w:type="dxa"/>
+            <w:tcBorders>
+              <w:bottom w:val="single" w:sz="4" w:space="0" w:color="auto"/>
+            </w:tcBorders>
+            <w:vAlign w:val="bottom"/>
+          </w:tcPr>
+          <w:p>
+            <w:pPr>
+              <w:jc w:val="center"/>
+              <w:rPr>
+                <w:sz w:val="18"/>
+              </w:rPr>
+            </w:pPr>
+            <w:r>
+              <w:rPr>
+                <w:sz w:val="18"/>
+              </w:rPr>
+              <w:t>{</w:t>
+            </w:r>
+            <w:proofErr w:type="gramStart"/>
+            <w:r>
+              <w:rPr>
+                <w:sz w:val="18"/>
+              </w:rPr>
+              <w:t xml:space="preserve">{ </w:t>
+            </w:r>
+            <w:r>
+              <w:rPr>
+                <w:sz w:val="18"/>
+              </w:rPr>
+              <w:t>rd</w:t>
+            </w:r>
+            <w:proofErr w:type="gramEnd"/>
+            <w:r>
+              <w:rPr>
+                <w:sz w:val="18"/>
+              </w:rPr>
+              <w:t>(</w:t>
+            </w:r>
+            <w:proofErr w:type="spellStart"/>
+            <w:r>
+              <w:rPr>
+                <w:sz w:val="18"/>
+              </w:rPr>
+              <w:t>bv.coti</w:t>
+            </w:r>
+            <w:r>
+              <w:rPr>
+                <w:sz w:val="18"/>
+              </w:rPr>
               <w:lastRenderedPageBreak/>
-              <w:t>EXONÉRATION DE COTISATIONS JUNIOR</w:t>
-            </w:r>
-          </w:p>
-        </w:tc>
-        <w:tc>
-          <w:tcPr>
-            <w:tcW w:w="992" w:type="dxa"/>
+              <w:t>_</w:t>
+            </w:r>
+            <w:r>
+              <w:rPr>
+                <w:sz w:val="18"/>
+              </w:rPr>
+              <w:t>exonerations</w:t>
+            </w:r>
+            <w:r>
+              <w:rPr>
+                <w:sz w:val="18"/>
+              </w:rPr>
+              <w:t>.montant_base</w:t>
+            </w:r>
+            <w:proofErr w:type="spellEnd"/>
+            <w:r>
+              <w:rPr>
+                <w:sz w:val="18"/>
+              </w:rPr>
+              <w:t>)</w:t>
+            </w:r>
+            <w:r>
+              <w:rPr>
+                <w:sz w:val="18"/>
+              </w:rPr>
+              <w:t xml:space="preserve"> }}</w:t>
+            </w:r>
+          </w:p>
+        </w:tc>
+        <w:tc>
+          <w:tcPr>
+            <w:tcW w:w="1134" w:type="dxa"/>
             <w:tcBorders>
               <w:bottom w:val="single" w:sz="4" w:space="0" w:color="auto"/>
             </w:tcBorders>
@@ -5546,12 +5418,100 @@
               <w:jc w:val="center"/>
               <w:rPr>
                 <w:sz w:val="18"/>
-              </w:rPr>
-            </w:pPr>
-            <w:r>
-              <w:rPr>
-                <w:sz w:val="18"/>
-              </w:rPr>
+                <w:lang w:val="en-GB"/>
+              </w:rPr>
+            </w:pPr>
+            <w:r>
+              <w:rPr>
+                <w:sz w:val="18"/>
+                <w:lang w:val="en-GB"/>
+              </w:rPr>
+              <w:lastRenderedPageBreak/>
+              <w:t xml:space="preserve">{{ </w:t>
+            </w:r>
+            <w:proofErr w:type="spellStart"/>
+            <w:r>
+              <w:rPr>
+                <w:sz w:val="18"/>
+                <w:lang w:val="en-GB"/>
+              </w:rPr>
+              <w:t>rd</w:t>
+            </w:r>
+            <w:proofErr w:type="spellEnd"/>
+            <w:r>
+              <w:rPr>
+                <w:sz w:val="18"/>
+                <w:lang w:val="en-GB"/>
+              </w:rPr>
+              <w:t>(</w:t>
+            </w:r>
+            <w:proofErr w:type="spellStart"/>
+            <w:r>
+              <w:rPr>
+                <w:sz w:val="18"/>
+                <w:lang w:val="en-GB"/>
+              </w:rPr>
+              <w:t>bv.coti_</w:t>
+            </w:r>
+            <w:r>
+              <w:rPr>
+                <w:sz w:val="18"/>
+                <w:lang w:val="en-GB"/>
+              </w:rPr>
+              <w:t>e</w:t>
+            </w:r>
+            <w:r>
+              <w:rPr>
+                <w:sz w:val="18"/>
+                <w:lang w:val="en-GB"/>
+              </w:rPr>
+              <w:lastRenderedPageBreak/>
+              <w:t>xonerations</w:t>
+            </w:r>
+            <w:r>
+              <w:rPr>
+                <w:sz w:val="18"/>
+                <w:lang w:val="en-GB"/>
+              </w:rPr>
+              <w:t>.montant_junior</w:t>
+            </w:r>
+            <w:proofErr w:type="spellEnd"/>
+            <w:r>
+              <w:rPr>
+                <w:sz w:val="18"/>
+                <w:lang w:val="en-GB"/>
+              </w:rPr>
+              <w:t>)</w:t>
+            </w:r>
+            <w:r>
+              <w:rPr>
+                <w:sz w:val="18"/>
+                <w:lang w:val="en-GB"/>
+              </w:rPr>
+              <w:t xml:space="preserve"> }}</w:t>
+            </w:r>
+          </w:p>
+        </w:tc>
+        <w:tc>
+          <w:tcPr>
+            <w:tcW w:w="1202" w:type="dxa"/>
+            <w:tcBorders>
+              <w:bottom w:val="single" w:sz="4" w:space="0" w:color="auto"/>
+            </w:tcBorders>
+            <w:vAlign w:val="bottom"/>
+          </w:tcPr>
+          <w:p>
+            <w:pPr>
+              <w:jc w:val="center"/>
+              <w:rPr>
+                <w:sz w:val="18"/>
+              </w:rPr>
+            </w:pPr>
+            <w:r>
+              <w:rPr>
+                <w:sz w:val="18"/>
+              </w:rPr>
+              <w:lastRenderedPageBreak/>
               <w:t>{</w:t>
             </w:r>
             <w:proofErr w:type="gramStart"/>
@@ -5585,13 +5545,20 @@
               <w:rPr>
                 <w:sz w:val="18"/>
               </w:rPr>
-              <w:t>exonerations</w:t>
-            </w:r>
-            <w:r>
-              <w:rPr>
-                <w:sz w:val="18"/>
-              </w:rPr>
-              <w:t>.montant_base</w:t>
+              <w:t>ex</w:t>
+            </w:r>
+            <w:r>
+              <w:rPr>
+                <w:sz w:val="18"/>
+              </w:rPr>
+              <w:lastRenderedPageBreak/>
+              <w:t>onerations</w:t>
+            </w:r>
+            <w:r>
+              <w:rPr>
+                <w:sz w:val="18"/>
+              </w:rPr>
+              <w:t>.taux_realisateur</w:t>
             </w:r>
             <w:proofErr w:type="spellEnd"/>
             <w:r>
@@ -5610,7 +5577,7 @@
         </w:tc>
         <w:tc>
           <w:tcPr>
-            <w:tcW w:w="1134" w:type="dxa"/>
+            <w:tcW w:w="1105" w:type="dxa"/>
             <w:tcBorders>
               <w:bottom w:val="single" w:sz="4" w:space="0" w:color="auto"/>
             </w:tcBorders>
@@ -5621,199 +5588,54 @@
               <w:jc w:val="center"/>
               <w:rPr>
                 <w:sz w:val="18"/>
-                <w:lang w:val="en-GB"/>
-              </w:rPr>
-            </w:pPr>
-            <w:r>
-              <w:rPr>
-                <w:sz w:val="18"/>
-                <w:lang w:val="en-GB"/>
-              </w:rPr>
-              <w:t xml:space="preserve">{{ </w:t>
+              </w:rPr>
+            </w:pPr>
+            <w:r>
+              <w:rPr>
+                <w:sz w:val="18"/>
+              </w:rPr>
+              <w:lastRenderedPageBreak/>
+              <w:t>{</w:t>
+            </w:r>
+            <w:proofErr w:type="gramStart"/>
+            <w:r>
+              <w:rPr>
+                <w:sz w:val="18"/>
+              </w:rPr>
+              <w:t xml:space="preserve">{ </w:t>
+            </w:r>
+            <w:r>
+              <w:rPr>
+                <w:sz w:val="18"/>
+              </w:rPr>
+              <w:t>rd</w:t>
+            </w:r>
+            <w:proofErr w:type="gramEnd"/>
+            <w:r>
+              <w:rPr>
+                <w:sz w:val="18"/>
+              </w:rPr>
+              <w:t>(</w:t>
             </w:r>
             <w:proofErr w:type="spellStart"/>
             <w:r>
               <w:rPr>
                 <w:sz w:val="18"/>
-                <w:lang w:val="en-GB"/>
-              </w:rPr>
-              <w:t>rd</w:t>
-            </w:r>
-            <w:proofErr w:type="spellEnd"/>
-            <w:r>
-              <w:rPr>
-                <w:sz w:val="18"/>
-                <w:lang w:val="en-GB"/>
-              </w:rPr>
-              <w:t>(</w:t>
-            </w:r>
-            <w:proofErr w:type="spellStart"/>
-            <w:r>
-              <w:rPr>
-                <w:sz w:val="18"/>
-                <w:lang w:val="en-GB"/>
               </w:rPr>
               <w:t>bv.coti_</w:t>
             </w:r>
             <w:r>
               <w:rPr>
                 <w:sz w:val="18"/>
-                <w:lang w:val="en-GB"/>
-              </w:rPr>
-              <w:t>exonerations</w:t>
-            </w:r>
-            <w:r>
-              <w:rPr>
-                <w:sz w:val="18"/>
-                <w:lang w:val="en-GB"/>
-              </w:rPr>
-              <w:t>.montant_junior</w:t>
-            </w:r>
-            <w:proofErr w:type="spellEnd"/>
-            <w:r>
-              <w:rPr>
-                <w:sz w:val="18"/>
-                <w:lang w:val="en-GB"/>
-              </w:rPr>
-              <w:t>)</w:t>
-            </w:r>
-            <w:r>
-              <w:rPr>
-                <w:sz w:val="18"/>
-                <w:lang w:val="en-GB"/>
-              </w:rPr>
-              <w:t xml:space="preserve"> }}</w:t>
-            </w:r>
-          </w:p>
-        </w:tc>
-        <w:tc>
-          <w:tcPr>
-            <w:tcW w:w="1202" w:type="dxa"/>
-            <w:tcBorders>
-              <w:bottom w:val="single" w:sz="4" w:space="0" w:color="auto"/>
-            </w:tcBorders>
-            <w:vAlign w:val="bottom"/>
-          </w:tcPr>
-          <w:p>
-            <w:pPr>
-              <w:jc w:val="center"/>
-              <w:rPr>
-                <w:sz w:val="18"/>
-              </w:rPr>
-            </w:pPr>
-            <w:r>
-              <w:rPr>
-                <w:sz w:val="18"/>
-              </w:rPr>
-              <w:t>{</w:t>
-            </w:r>
-            <w:proofErr w:type="gramStart"/>
-            <w:r>
-              <w:rPr>
-                <w:sz w:val="18"/>
-              </w:rPr>
-              <w:t xml:space="preserve">{ </w:t>
-            </w:r>
-            <w:r>
-              <w:rPr>
-                <w:sz w:val="18"/>
-              </w:rPr>
-              <w:t>rd</w:t>
-            </w:r>
-            <w:proofErr w:type="gramEnd"/>
-            <w:r>
-              <w:rPr>
-                <w:sz w:val="18"/>
-              </w:rPr>
-              <w:t>(</w:t>
-            </w:r>
-            <w:proofErr w:type="spellStart"/>
-            <w:r>
-              <w:rPr>
-                <w:sz w:val="18"/>
-              </w:rPr>
-              <w:t>bv.coti_</w:t>
-            </w:r>
-            <w:r>
-              <w:rPr>
-                <w:sz w:val="18"/>
-              </w:rPr>
-              <w:t>exonerations</w:t>
-            </w:r>
-            <w:r>
-              <w:rPr>
-                <w:sz w:val="18"/>
-              </w:rPr>
-              <w:t>.taux_realisateur</w:t>
-            </w:r>
-            <w:proofErr w:type="spellEnd"/>
-            <w:r>
-              <w:rPr>
-                <w:sz w:val="18"/>
-              </w:rPr>
-              <w:t>)</w:t>
-            </w:r>
-            <w:r>
-              <w:rPr>
-                <w:sz w:val="18"/>
-              </w:rPr>
-              <w:t xml:space="preserve"> }}</w:t>
-            </w:r>
-          </w:p>
-        </w:tc>
-        <w:tc>
-          <w:tcPr>
-            <w:tcW w:w="1105" w:type="dxa"/>
-            <w:tcBorders>
-              <w:bottom w:val="single" w:sz="4" w:space="0" w:color="auto"/>
-            </w:tcBorders>
-            <w:vAlign w:val="bottom"/>
-          </w:tcPr>
-          <w:p>
-            <w:pPr>
-              <w:jc w:val="center"/>
-              <w:rPr>
-                <w:sz w:val="18"/>
-              </w:rPr>
-            </w:pPr>
-            <w:r>
-              <w:rPr>
-                <w:sz w:val="18"/>
-              </w:rPr>
-              <w:t>{</w:t>
-            </w:r>
-            <w:proofErr w:type="gramStart"/>
-            <w:r>
-              <w:rPr>
-                <w:sz w:val="18"/>
-              </w:rPr>
-              <w:t xml:space="preserve">{ </w:t>
-            </w:r>
-            <w:r>
-              <w:rPr>
-                <w:sz w:val="18"/>
-              </w:rPr>
-              <w:t>rd</w:t>
-            </w:r>
-            <w:proofErr w:type="gramEnd"/>
-            <w:r>
-              <w:rPr>
-                <w:sz w:val="18"/>
-              </w:rPr>
-              <w:t>(</w:t>
-            </w:r>
-            <w:proofErr w:type="spellStart"/>
-            <w:r>
-              <w:rPr>
-                <w:sz w:val="18"/>
-              </w:rPr>
-              <w:t>bv.coti_</w:t>
-            </w:r>
-            <w:r>
-              <w:rPr>
-                <w:sz w:val="18"/>
-              </w:rPr>
-              <w:t>exonerations</w:t>
+              </w:rPr>
+              <w:t>e</w:t>
+            </w:r>
+            <w:r>
+              <w:rPr>
+                <w:sz w:val="18"/>
+              </w:rPr>
+              <w:lastRenderedPageBreak/>
+              <w:t>xonerations</w:t>
             </w:r>
             <w:r>
               <w:rPr>
@@ -7513,6 +7335,8 @@
               </w:rPr>
               <w:t>(part étudiant)</w:t>
             </w:r>
+            <w:bookmarkStart w:id="0" w:name="_GoBack"/>
+            <w:bookmarkEnd w:id="0"/>
           </w:p>
         </w:tc>
         <w:tc>
@@ -8962,16 +8786,7 @@
                 <w:sz w:val="16"/>
                 <w:szCs w:val="20"/>
               </w:rPr>
-              <w:t>Ce bulletin de versement ne constitue</w:t>
-            </w:r>
-            <w:bookmarkStart w:id="0" w:name="_GoBack"/>
-            <w:bookmarkEnd w:id="0"/>
-            <w:r>
-              <w:rPr>
-                <w:sz w:val="16"/>
-                <w:szCs w:val="20"/>
-              </w:rPr>
-              <w:t xml:space="preserve"> en aucun cas un bulletin de salaire, et par conséquent, n'ouvre pas droit à l’établissement d’une carte de séjour.</w:t>
+              <w:t>Ce bulletin de versement ne constitue en aucun cas un bulletin de salaire, et par conséquent, n'ouvre pas droit à l’établissement d’une carte de séjour.</w:t>
             </w:r>
           </w:p>
           <w:p>
@@ -9790,7 +9605,7 @@
 </file>
 
 <file path=customXml/itemProps1.xml><?xml version="1.0" encoding="utf-8"?>
-<ds:datastoreItem xmlns:ds="http://schemas.openxmlformats.org/officeDocument/2006/customXml" ds:itemID="{DC3DE407-B803-4A22-8D66-FEF61BE6324A}">
+<ds:datastoreItem xmlns:ds="http://schemas.openxmlformats.org/officeDocument/2006/customXml" ds:itemID="{E82E0DF4-C560-4D4E-BC2F-40E633AC3FE8}">
   <ds:schemaRefs>
     <ds:schemaRef ds:uri="http://schemas.openxmlformats.org/officeDocument/2006/bibliography"/>
   </ds:schemaRefs>

</xml_diff>